<commit_message>
Describe ClearAuth's AI layer as model-agnostic in the concept and PRD
</commit_message>
<xml_diff>
--- a/clearauth/docs/clearauth-concept.docx
+++ b/clearauth/docs/clearauth-concept.docx
@@ -659,7 +659,7 @@
           <w:sz w:val="22"/>
           <w:szCs w:val="22"/>
         </w:rPr>
-        <w:t xml:space="preserve">GenAI Maturity: Large language models (Claude, GPT-4) are now capable of clinically accurate documentation assistance, appeal letter generation, and guideline matching at production quality.</w:t>
+        <w:t>GenAI Maturity: Large language models are now capable of clinically accurate documentation assistance, appeal letter generation, and guideline matching at production quality.</w:t>
       </w:r>
     </w:p>
     <w:p>
@@ -3255,7 +3255,7 @@
           <w:sz w:val="22"/>
           <w:szCs w:val="22"/>
         </w:rPr>
-        <w:t xml:space="preserve">ClearAuth integrates Anthropic Claude (claude-sonnet-4-6) as its AI backbone, deployed with role-specific system prompts that ensure every AI interaction is contextually appropriate — clinical and evidence-based for providers, plain-language and empathetic for patients, criteria-driven and audit-ready for payers.</w:t>
+        <w:t>ClearAuth uses a large language model as its AI backbone, chosen per deployment (hosted or self-hosted) and deployed with role-specific system prompts that ensure every AI interaction is contextually appropriate — clinical and evidence-based for providers, plain-language and empathetic for patients, criteria-driven and audit-ready for payers.</w:t>
       </w:r>
     </w:p>
     <w:p>

</xml_diff>